<commit_message>
📄 DOCX firmado: 297446024 - 9/9/2026, 3:32:05 a.m.
</commit_message>
<xml_diff>
--- a/data/declaraciones/signed/297446024.docx
+++ b/data/declaraciones/signed/297446024.docx
@@ -4184,7 +4184,7 @@
         <w:rPr>
           <w:lang w:val="es-MX"/>
         </w:rPr>
-        <w:t xml:space="preserve">NIÑO FRESA S.R.L.</w:t>
+        <w:t xml:space="preserve">Niño Fresa SRL</w:t>
       </w:r>
       <w:proofErr w:type="spellStart"/>
       <w:r>
@@ -4353,7 +4353,7 @@
         <w:rPr>
           <w:lang w:val="es-MX"/>
         </w:rPr>
-        <w:t xml:space="preserve">Fecha: 05 de febrero de 2026</w:t>
+        <w:t xml:space="preserve">Fecha: 08 de septiembre de 2026</w:t>
       </w:r>
       <w:proofErr w:type="spellStart"/>
       <w:r>

</xml_diff>